<commit_message>
feat: add Mercor Certified Introduction to Agents credential to 3D portfolio and CV
</commit_message>
<xml_diff>
--- a/CV_Jaya_Hartono_Pinuyut_Updated.docx
+++ b/CV_Jaya_Hartono_Pinuyut_Updated.docx
@@ -673,6 +673,71 @@
           <w:color w:val="0F172A"/>
           <w:sz w:val="18"/>
         </w:rPr>
+        <w:t>Mercor Certified: Introduction to Agents (AI Agent Evaluation)</w:t>
+      </w:r>
+      <w:r>
+        <w:rPr>
+          <w:rFonts w:ascii="Arial" w:hAnsi="Arial"/>
+          <w:color w:val="475569"/>
+          <w:sz w:val="16"/>
+        </w:rPr>
+        <w:t xml:space="preserve"> (Completed Oct 31, 2026 | ID: MRC-2026-5XW2RQSG)</w:t>
+      </w:r>
+    </w:p>
+    <w:p>
+      <w:pPr>
+        <w:pStyle w:val="ListBullet"/>
+        <w:spacing w:after="20"/>
+      </w:pPr>
+      <w:r>
+        <w:rPr>
+          <w:rFonts w:ascii="Arial" w:hAnsi="Arial"/>
+          <w:color w:val="1E293B"/>
+          <w:sz w:val="16"/>
+        </w:rPr>
+        <w:t>Demonstrated rigor, calibration, and clarity in autonomous AI agent evaluation and benchmarking under Mercor's certified curriculum.</w:t>
+      </w:r>
+    </w:p>
+    <w:p>
+      <w:pPr>
+        <w:pStyle w:val="ListBullet"/>
+        <w:spacing w:after="20"/>
+      </w:pPr>
+      <w:r>
+        <w:rPr>
+          <w:rFonts w:ascii="Arial" w:hAnsi="Arial"/>
+          <w:color w:val="1E293B"/>
+          <w:sz w:val="16"/>
+        </w:rPr>
+        <w:t>Specialized in multi-step agent trajectory auditing, goal convergence, tool-use validation, and error diagnostics.</w:t>
+      </w:r>
+    </w:p>
+    <w:p>
+      <w:pPr>
+        <w:pStyle w:val="ListBullet"/>
+        <w:spacing w:after="20"/>
+      </w:pPr>
+      <w:r>
+        <w:rPr>
+          <w:rFonts w:ascii="Arial" w:hAnsi="Arial"/>
+          <w:color w:val="1E293B"/>
+          <w:sz w:val="16"/>
+        </w:rPr>
+        <w:t>Verification: https://work.mercor.com/learn/verify/MRC-2026-5XW2RQSG</w:t>
+      </w:r>
+    </w:p>
+    <w:p>
+      <w:pPr>
+        <w:keepNext/>
+        <w:spacing w:before="40" w:after="20"/>
+      </w:pPr>
+      <w:r>
+        <w:rPr>
+          <w:rFonts w:ascii="Arial" w:hAnsi="Arial"/>
+          <w:b/>
+          <w:color w:val="0F172A"/>
+          <w:sz w:val="18"/>
+        </w:rPr>
         <w:t>Approved Indonesian Linguistic Expert — Mercor</w:t>
       </w:r>
       <w:r>
@@ -1097,6 +1162,62 @@
                 <w:sz w:val="16"/>
               </w:rPr>
               <w:t>Validity / Year</w:t>
+            </w:r>
+          </w:p>
+        </w:tc>
+      </w:tr>
+      <w:tr>
+        <w:tc>
+          <w:tcPr>
+            <w:tcW w:type="dxa" w:w="3552"/>
+          </w:tcPr>
+          <w:p>
+            <w:pPr>
+              <w:spacing w:after="20" w:before="20"/>
+            </w:pPr>
+            <w:r>
+              <w:rPr>
+                <w:rFonts w:ascii="Arial" w:hAnsi="Arial"/>
+                <w:color w:val="1E293B"/>
+                <w:sz w:val="15"/>
+              </w:rPr>
+              <w:t>Mercor Certified: Introduction to Agents</w:t>
+            </w:r>
+          </w:p>
+        </w:tc>
+        <w:tc>
+          <w:tcPr>
+            <w:tcW w:type="dxa" w:w="3552"/>
+          </w:tcPr>
+          <w:p>
+            <w:pPr>
+              <w:spacing w:after="20" w:before="20"/>
+            </w:pPr>
+            <w:r>
+              <w:rPr>
+                <w:rFonts w:ascii="Arial" w:hAnsi="Arial"/>
+                <w:color w:val="1E293B"/>
+                <w:sz w:val="15"/>
+              </w:rPr>
+              <w:t>Mercor (ID: MRC-2026-5XW2RQSG)</w:t>
+            </w:r>
+          </w:p>
+        </w:tc>
+        <w:tc>
+          <w:tcPr>
+            <w:tcW w:type="dxa" w:w="3552"/>
+          </w:tcPr>
+          <w:p>
+            <w:pPr>
+              <w:spacing w:after="20" w:before="20"/>
+            </w:pPr>
+            <w:r>
+              <w:rPr>
+                <w:rFonts w:ascii="Arial" w:hAnsi="Arial"/>
+                <w:color w:val="1E293B"/>
+                <w:sz w:val="15"/>
+              </w:rPr>
+              <w:t>Oct 2026</w:t>
             </w:r>
           </w:p>
         </w:tc>

</xml_diff>

<commit_message>
feat: add Google & Gemini Accredible verified credential links to 3D portfolio and CV
</commit_message>
<xml_diff>
--- a/CV_Jaya_Hartono_Pinuyut_Updated.docx
+++ b/CV_Jaya_Hartono_Pinuyut_Updated.docx
@@ -1293,7 +1293,7 @@
                 <w:color w:val="1E293B"/>
                 <w:sz w:val="15"/>
               </w:rPr>
-              <w:t>Pendidik Tersertifikasi Gemini (Gemini Certified Educator)</w:t>
+              <w:t>Pendidik Tersertifikasi Gemini (Verify: edu.google.accredible.com/293b680b-115e-42e7-b917-6eccf1dcfe66)</w:t>
             </w:r>
           </w:p>
         </w:tc>
@@ -1329,7 +1329,7 @@
                 <w:color w:val="1E293B"/>
                 <w:sz w:val="15"/>
               </w:rPr>
-              <w:t>2026 – 2029</w:t>
+              <w:t>May 2026 – 2029</w:t>
             </w:r>
           </w:p>
         </w:tc>
@@ -1349,7 +1349,63 @@
                 <w:color w:val="1E293B"/>
                 <w:sz w:val="15"/>
               </w:rPr>
-              <w:t>Google Certified Educator - Level 1 &amp; Level 2</w:t>
+              <w:t>Google Certified Educator - Level 2 (Verify: edu.google.accredible.com/e9a8d3a3-0f05-4f4d-9558-e976d04c848e)</w:t>
+            </w:r>
+          </w:p>
+        </w:tc>
+        <w:tc>
+          <w:tcPr>
+            <w:tcW w:type="dxa" w:w="3552"/>
+          </w:tcPr>
+          <w:p>
+            <w:pPr>
+              <w:spacing w:after="20" w:before="20"/>
+            </w:pPr>
+            <w:r>
+              <w:rPr>
+                <w:rFonts w:ascii="Arial" w:hAnsi="Arial"/>
+                <w:color w:val="1E293B"/>
+                <w:sz w:val="15"/>
+              </w:rPr>
+              <w:t>Google for Education</w:t>
+            </w:r>
+          </w:p>
+        </w:tc>
+        <w:tc>
+          <w:tcPr>
+            <w:tcW w:type="dxa" w:w="3552"/>
+          </w:tcPr>
+          <w:p>
+            <w:pPr>
+              <w:spacing w:after="20" w:before="20"/>
+            </w:pPr>
+            <w:r>
+              <w:rPr>
+                <w:rFonts w:ascii="Arial" w:hAnsi="Arial"/>
+                <w:color w:val="1E293B"/>
+                <w:sz w:val="15"/>
+              </w:rPr>
+              <w:t>May 2026 – 2029</w:t>
+            </w:r>
+          </w:p>
+        </w:tc>
+      </w:tr>
+      <w:tr>
+        <w:tc>
+          <w:tcPr>
+            <w:tcW w:type="dxa" w:w="3552"/>
+          </w:tcPr>
+          <w:p>
+            <w:pPr>
+              <w:spacing w:after="20" w:before="20"/>
+            </w:pPr>
+            <w:r>
+              <w:rPr>
+                <w:rFonts w:ascii="Arial" w:hAnsi="Arial"/>
+                <w:color w:val="1E293B"/>
+                <w:sz w:val="15"/>
+              </w:rPr>
+              <w:t>Google Certified Educator - Level 1 (Verify: edu.google.accredible.com/191a3e2b-ad39-49bd-98c3-c17143c7328d)</w:t>
             </w:r>
           </w:p>
         </w:tc>

</xml_diff>